<commit_message>
Update reviewed public portfolio
</commit_message>
<xml_diff>
--- a/assets/resume/public-resume.docx
+++ b/assets/resume/public-resume.docx
@@ -74,7 +74,7 @@
     </w:p>
     <w:p>
       <w:r>
-        <w:t>深度参与杭州市具身智能、集成电路、生物医药与医疗器械三大重点领域产业报告编制；跟随团队赴传化科技城、灏存科技、深度原理等企业进行实地走访、项目洽谈；协助完成杭州上市公司场景创新与合规对接会、萧山区POC青年服务联盟揭牌等活动的筹备与执行工作；系统梳理产业指数相关学术研究与指标体系，，独立搭建杭州产业指数评价体系初稿；自主开发爬虫程序，批量采集并结构化整理2026世界机器人博览会、世界人工智能大会共1400余家参展厂商及其产品信息等，为公司产业链梳理项目提供扎实数据支撑。</w:t>
+        <w:t>深度参与杭州市具身智能、集成电路、生物医药与医疗器械三大重点领域产业报告编制；跟随团队赴传化科技城、灏存科技、深度原理等企业进行实地走访、项目洽谈；协助完成杭州上市公司场景创新与合规对接会、萧山区POC青年服务联盟揭牌等活动的筹备与执行工作；系统梳理产业指数相关学术研究与指标体系，独立搭建杭州产业指数评价体系初稿；自主开发爬虫程序，批量采集并结构化整理2026世界机器人博览会、世界人工智能大会共1400余家参展厂商及其产品信息等，为公司产业链梳理项目提供扎实数据支撑。</w:t>
       </w:r>
     </w:p>
     <w:p>
@@ -121,7 +121,7 @@
         <w:rPr>
           <w:b/>
         </w:rPr>
-        <w:t>2025.08 三下乡社会实践 团队负责人及答辩展示</w:t>
+        <w:t>2025.08 三下乡社会实践 团队负责人及答辩展示（同期开展芙蓉学子）</w:t>
       </w:r>
     </w:p>
     <w:p>

</xml_diff>